<commit_message>
Title size changed to 36
</commit_message>
<xml_diff>
--- a/City College Plymouth - Assignment 0.docx
+++ b/City College Plymouth - Assignment 0.docx
@@ -8,16 +8,16 @@
         <w:rPr>
           <w:b/>
           <w:bCs/>
-          <w:sz w:val="48"/>
-          <w:szCs w:val="48"/>
+          <w:sz w:val="56"/>
+          <w:szCs w:val="56"/>
         </w:rPr>
       </w:pPr>
       <w:r>
         <w:rPr>
           <w:b/>
           <w:bCs/>
-          <w:sz w:val="48"/>
-          <w:szCs w:val="48"/>
+          <w:sz w:val="56"/>
+          <w:szCs w:val="56"/>
         </w:rPr>
         <w:t>Assignment Plan</w:t>
       </w:r>
@@ -1552,7 +1552,6 @@
           <w:sz w:val="32"/>
           <w:szCs w:val="32"/>
         </w:rPr>
-        <w:lastRenderedPageBreak/>
         <w:t xml:space="preserve">Day </w:t>
       </w:r>
       <w:r>
@@ -2226,7 +2225,6 @@
           <w:sz w:val="52"/>
           <w:szCs w:val="52"/>
         </w:rPr>
-        <w:lastRenderedPageBreak/>
         <w:t>TASK C</w:t>
       </w:r>
     </w:p>
@@ -2722,7 +2720,6 @@
           <w:sz w:val="32"/>
           <w:szCs w:val="32"/>
         </w:rPr>
-        <w:lastRenderedPageBreak/>
         <w:t xml:space="preserve">Day 9 </w:t>
       </w:r>
       <w:r>

</xml_diff>